<commit_message>
Rev 2: Part B aligned 1:1 with Part D; Part C upgraded lines cut to one simple sentence; Part D weak versions in level-3 English
</commit_message>
<xml_diff>
--- a/6B Grammar Lesson 4 - Giving Examples (Teacher's).docx
+++ b/6B Grammar Lesson 4 - Giving Examples (Teacher's).docx
@@ -665,7 +665,7 @@
     <w:p>
       <w:r>
         <w:rPr/>
-        <w:t>Topic: the workplace.</w:t>
+        <w:t>Topic: the workplace. The six upgrades below are the words you will need in Part D.</w:t>
       </w:r>
     </w:p>
     <w:tbl>
@@ -747,20 +747,20 @@
               <w:rPr>
                 <w:i/>
               </w:rPr>
-              <w:t xml:space="preserve">Many office workers </w:t>
+              <w:t xml:space="preserve">The company </w:t>
             </w:r>
             <w:r>
               <w:rPr>
                 <w:i/>
                 <w:u w:val="single"/>
               </w:rPr>
-              <w:t>have too much work</w:t>
+              <w:t>loses many young employees every year</w:t>
             </w:r>
             <w:r>
               <w:rPr>
                 <w:i/>
               </w:rPr>
-              <w:t xml:space="preserve"> to finish in one day.</w:t>
+              <w:t>.</w:t>
             </w:r>
           </w:p>
           <w:p/>
@@ -774,7 +774,7 @@
               <w:rPr>
                 <w:b/>
               </w:rPr>
-              <w:t>struggle with an excessive workload</w:t>
+              <w:t>struggles to retain young talent</w:t>
             </w:r>
           </w:p>
           <w:p/>
@@ -808,20 +808,20 @@
               <w:rPr>
                 <w:i/>
               </w:rPr>
-              <w:t xml:space="preserve">Employees often </w:t>
+              <w:t xml:space="preserve">Managers should </w:t>
             </w:r>
             <w:r>
               <w:rPr>
                 <w:i/>
                 <w:u w:val="single"/>
               </w:rPr>
-              <w:t>feel so tired</w:t>
+              <w:t>praise employees when they do a good job</w:t>
             </w:r>
             <w:r>
               <w:rPr>
                 <w:i/>
               </w:rPr>
-              <w:t xml:space="preserve"> that they cannot enjoy their weekends.</w:t>
+              <w:t>.</w:t>
             </w:r>
           </w:p>
           <w:p/>
@@ -835,7 +835,7 @@
               <w:rPr>
                 <w:b/>
               </w:rPr>
-              <w:t>suffer from burnout</w:t>
+              <w:t>recognise employees’ contributions</w:t>
             </w:r>
           </w:p>
           <w:p/>
@@ -869,14 +869,14 @@
               <w:rPr>
                 <w:i/>
               </w:rPr>
-              <w:t xml:space="preserve">Companies can </w:t>
+              <w:t xml:space="preserve">Employees can </w:t>
             </w:r>
             <w:r>
               <w:rPr>
                 <w:i/>
                 <w:u w:val="single"/>
               </w:rPr>
-              <w:t>let employees start and finish work at different times</w:t>
+              <w:t>do their jobs from home on some days</w:t>
             </w:r>
             <w:r>
               <w:rPr>
@@ -896,7 +896,7 @@
               <w:rPr>
                 <w:b/>
               </w:rPr>
-              <w:t>offer flexible working hours</w:t>
+              <w:t>work remotely on a hybrid schedule</w:t>
             </w:r>
           </w:p>
           <w:p/>
@@ -925,14 +925,14 @@
               <w:rPr>
                 <w:i/>
               </w:rPr>
-              <w:t xml:space="preserve">Managers should </w:t>
+              <w:t xml:space="preserve">Bosses often </w:t>
             </w:r>
             <w:r>
               <w:rPr>
                 <w:i/>
                 <w:u w:val="single"/>
               </w:rPr>
-              <w:t>praise employees when they do a good job</w:t>
+              <w:t>send messages to staff at night</w:t>
             </w:r>
             <w:r>
               <w:rPr>
@@ -951,7 +951,7 @@
               <w:rPr>
                 <w:b/>
               </w:rPr>
-              <w:t>recognise employees’ contributions</w:t>
+              <w:t>contact staff outside office hours</w:t>
             </w:r>
           </w:p>
           <w:p/>
@@ -1041,14 +1041,14 @@
               <w:rPr>
                 <w:i/>
               </w:rPr>
-              <w:t xml:space="preserve">The company </w:t>
+              <w:t xml:space="preserve">New staff are given work but </w:t>
             </w:r>
             <w:r>
               <w:rPr>
                 <w:i/>
                 <w:u w:val="single"/>
               </w:rPr>
-              <w:t>loses many young employees every year</w:t>
+              <w:t>no training</w:t>
             </w:r>
             <w:r>
               <w:rPr>
@@ -1067,7 +1067,7 @@
               <w:rPr>
                 <w:b/>
               </w:rPr>
-              <w:t>struggles to retain young talent</w:t>
+              <w:t>no induction or mentoring</w:t>
             </w:r>
           </w:p>
           <w:p/>
@@ -1118,7 +1118,7 @@
             </w:pPr>
             <w:r>
               <w:rPr/>
-              <w:t>For example, working long hours is bad for employees’ health.</w:t>
+              <w:t>For example, many workers work long hours and this is bad for their health.</w:t>
             </w:r>
           </w:p>
           <w:p>
@@ -1127,7 +1127,7 @@
             </w:pPr>
             <w:r>
               <w:rPr/>
-              <w:t>For example, employees who answer messages at night never really rest.</w:t>
+              <w:t>For example, many workers answer messages at night and they cannot rest well.</w:t>
             </w:r>
           </w:p>
           <w:p>
@@ -1136,7 +1136,7 @@
             </w:pPr>
             <w:r>
               <w:rPr/>
-              <w:t>For example, an employee may miss dinner with his family because of overtime.</w:t>
+              <w:t>For example, a worker has to work late and he cannot have dinner with his family.</w:t>
             </w:r>
           </w:p>
           <w:p>
@@ -1145,7 +1145,7 @@
             </w:pPr>
             <w:r>
               <w:rPr/>
-              <w:t>For example, some governments have made laws to protect workers.</w:t>
+              <w:t>For example, some countries have laws to protect workers.</w:t>
             </w:r>
           </w:p>
         </w:tc>
@@ -1234,7 +1234,7 @@
             </w:pPr>
             <w:r>
               <w:rPr/>
-              <w:t>For example, working long hours is bad for employees’ health.</w:t>
+              <w:t>For example, many workers work long hours and this is bad for their health.</w:t>
             </w:r>
           </w:p>
         </w:tc>
@@ -1271,31 +1271,21 @@
               <w:rPr>
                 <w:b/>
               </w:rPr>
-              <w:t>According to a 2021 joint study by the World Health Organization and the International Labour Organization</w:t>
+              <w:t>According to a 2021 WHO and ILO study</w:t>
             </w:r>
             <w:r>
               <w:rPr/>
-              <w:t xml:space="preserve">, employees who work </w:t>
+              <w:t xml:space="preserve">, working 55 hours or more a week </w:t>
             </w:r>
             <w:r>
               <w:rPr>
                 <w:b/>
               </w:rPr>
-              <w:t>55 hours or more a week</w:t>
+              <w:t>raises the risk of stroke by 35%</w:t>
             </w:r>
             <w:r>
               <w:rPr/>
-              <w:t xml:space="preserve"> run a </w:t>
-            </w:r>
-            <w:r>
-              <w:rPr>
-                <w:b/>
-              </w:rPr>
-              <w:t>35% higher risk of stroke</w:t>
-            </w:r>
-            <w:r>
-              <w:rPr/>
-              <w:t xml:space="preserve"> than those who work 35 to 40 hours a week.</w:t>
+              <w:t>.</w:t>
             </w:r>
           </w:p>
         </w:tc>
@@ -1313,7 +1303,7 @@
         <w:rPr>
           <w:color w:val="C00000"/>
         </w:rPr>
-        <w:t>“According to” + a NAMED source + the year is the whole formula — never “studies show”, and never a number you have invented. Learn ONE finding for the topic and you own this way; the figures above are real (WHO and ILO, 2021) and can be quoted as they are.</w:t>
+        <w:t>“According to” + a NAMED source + the year is the whole formula — never “studies show”, and never a number you have invented. WHO = World Health Organization, ILO = International Labour Organization. Learn ONE finding for the topic and you own this way.</w:t>
       </w:r>
     </w:p>
     <w:p>
@@ -1399,7 +1389,7 @@
             </w:pPr>
             <w:r>
               <w:rPr/>
-              <w:t>For example, employees who answer messages at night never really rest.</w:t>
+              <w:t>For example, many workers answer messages at night and they cannot rest well.</w:t>
             </w:r>
           </w:p>
         </w:tc>
@@ -1440,7 +1430,7 @@
             </w:r>
             <w:r>
               <w:rPr/>
-              <w:t xml:space="preserve"> a manager answers one “quick” message at bedtime: the phone stays on the pillow, the mind starts drafting tomorrow’s replies, and the hours meant for sleep are spent half at work.</w:t>
+              <w:t xml:space="preserve"> a worker answers one message at bedtime: the phone stays on the pillow, the mind keeps drafting replies, and the night’s sleep is gone.</w:t>
             </w:r>
           </w:p>
         </w:tc>
@@ -1458,7 +1448,7 @@
         <w:rPr>
           <w:color w:val="C00000"/>
         </w:rPr>
-        <w:t>No source and no name needed — the safety net for students who remember nothing. Keep it to three moves (first this, then that, so the harm), and make the LAST move the damage your argument is about. It must stay general: once one named person does one thing, it is Way 3.</w:t>
+        <w:t>No source and no name needed — the safety net when you remember no facts. Three moves (first this, then that, so the harm), and the last move must be the damage you are arguing about. Keep it general: one named person makes it Way 3.</w:t>
       </w:r>
     </w:p>
     <w:p>
@@ -1544,7 +1534,7 @@
             </w:pPr>
             <w:r>
               <w:rPr/>
-              <w:t>For example, an employee may miss dinner with his family because of overtime.</w:t>
+              <w:t>For example, a worker has to work late and he cannot have dinner with his family.</w:t>
             </w:r>
           </w:p>
         </w:tc>
@@ -1585,17 +1575,7 @@
             </w:r>
             <w:r>
               <w:rPr/>
-              <w:t xml:space="preserve"> a junior clerk in Kwun Tong </w:t>
-            </w:r>
-            <w:r>
-              <w:rPr>
-                <w:b/>
-              </w:rPr>
-              <w:t>who</w:t>
-            </w:r>
-            <w:r>
-              <w:rPr/>
-              <w:t xml:space="preserve"> leaves the office at nine every evening: by the time he reaches home, his daughter is asleep and the dinner his mother kept warm has gone cold.</w:t>
+              <w:t xml:space="preserve"> a clerk who leaves the office at nine every evening: by the time he gets home, his daughter is asleep and his dinner is cold.</w:t>
             </w:r>
           </w:p>
         </w:tc>
@@ -1613,7 +1593,7 @@
         <w:rPr>
           <w:color w:val="C00000"/>
         </w:rPr>
-        <w:t>Give the marker a scene they can SEE: one worker, one place, one object (a phone, a cold dinner, a desk lamp). Write “Imagine a junior clerk …”, never “Imagine if you …” — the essay bans “you”. Keep numbers out of the scene: they read as fake statistics.</w:t>
+        <w:t>Give the marker a scene they can SEE: one worker, one place, one object (a cold dinner, a phone, a desk lamp). Write “Imagine a clerk …”, never “Imagine if you …” — the essay bans “you”. No numbers in the scene: they read as fake statistics.</w:t>
       </w:r>
     </w:p>
     <w:p/>
@@ -1695,7 +1675,7 @@
             </w:pPr>
             <w:r>
               <w:rPr/>
-              <w:t>For example, some governments have made laws to protect workers.</w:t>
+              <w:t>For example, some countries have laws to protect workers.</w:t>
             </w:r>
           </w:p>
         </w:tc>
@@ -1742,11 +1722,11 @@
               <w:rPr>
                 <w:b/>
               </w:rPr>
-              <w:t>Australia gave employees the legal right to ignore work emails and calls after hours</w:t>
+              <w:t>Australia gave workers the right to ignore work messages after hours</w:t>
             </w:r>
             <w:r>
               <w:rPr/>
-              <w:t xml:space="preserve"> — evidence that even governments now treat constant availability as a problem.</w:t>
+              <w:t xml:space="preserve"> — evidence that even governments treat this as a problem.</w:t>
             </w:r>
           </w:p>
         </w:tc>
@@ -1764,7 +1744,7 @@
         <w:rPr>
           <w:color w:val="C00000"/>
         </w:rPr>
-        <w:t>One real event, dated, with the country named, plus the little “evidence that …” clause that ties it back to your argument. France did the same in January 2017 for companies with fifty or more staff. Never invent an event, and never quote one you cannot describe in a single sentence.</w:t>
+        <w:t>One real event, dated, with the country named, plus the little “evidence that …” clause that ties it back to your argument. France did the same in January 2017 for companies with fifty or more staff. Never invent an event.</w:t>
       </w:r>
     </w:p>
     <w:p/>
@@ -1780,7 +1760,7 @@
         <w:rPr>
           <w:color w:val="C00000"/>
         </w:rPr>
-        <w:t>today’s four ways are a MENU, not four rules. The marker’s test is simple — can I picture it, and does it prove the point? — not “did you cite something?”. Way 1 is the strongest but needs a memorised finding; Ways 2 and 3 need no reading at all. ONE way per example: two ways in one paragraph reads as two examples and usually loses the round-off. Keep the “because” workings in [Explain] — an example illustrates, it does not explain.</w:t>
+        <w:t>today’s four ways are a MENU, not four rules. The marker’s test is simple — can I picture it, and does it prove the point? — not “did you cite something?”. Way 1 is the strongest but needs a memorised finding; Ways 2 and 3 need no reading at all. ONE way per example: two ways in one paragraph reads as two examples and usually loses the round-off. Keep the “because” workings in [Explain] — an example illustrates, it does not explain. Every upgraded line above stays ONE simple sentence on purpose: the pattern must be easy to copy, not impressive to read.</w:t>
       </w:r>
     </w:p>
     <w:p>
@@ -1864,7 +1844,7 @@
           <w:p>
             <w:r>
               <w:rPr/>
-              <w:t>For example, many young employees leave their jobs after one year.</w:t>
+              <w:t>For example, the company loses many young employees every year.</w:t>
             </w:r>
           </w:p>
         </w:tc>
@@ -1917,7 +1897,7 @@
         <w:rPr>
           <w:color w:val="C00000"/>
         </w:rPr>
-        <w:t>Any correctly framed finding is accepted (source + year + figure) — “According to Gallup (2023), more than half of the world’s employees are looking for another job.” The figures here are real.</w:t>
+        <w:t>Any correctly framed finding is accepted (source + year + figure) — the figures here are real. Part B tells you what to call the problem: the company struggles to retain young talent.</w:t>
       </w:r>
     </w:p>
     <w:p>
@@ -1966,7 +1946,7 @@
           <w:p>
             <w:r>
               <w:rPr/>
-              <w:t>For example, employees who are never praised stop trying.</w:t>
+              <w:t>For example, managers do not praise employees when they do a good job.</w:t>
             </w:r>
           </w:p>
         </w:tc>
@@ -1998,7 +1978,7 @@
                 <w:b/>
                 <w:color w:val="C00000"/>
               </w:rPr>
-              <w:t>Consider what happens when praise never comes: the extra effort goes unnoticed, the employee stops volunteering for the difficult tasks, and a competent worker quietly becomes an average one.</w:t>
+              <w:t>Consider what happens when praise never comes: the extra effort goes unnoticed, the worker stops helping with the difficult tasks, and a good employee quietly becomes an average one.</w:t>
             </w:r>
           </w:p>
         </w:tc>
@@ -2019,7 +1999,7 @@
         <w:rPr>
           <w:color w:val="C00000"/>
         </w:rPr>
-        <w:t>Accept any clear three-move process (first … then … so that …). The last move must be the harm — the point the paragraph is arguing, not a repeat of the topic sentence.</w:t>
+        <w:t>Accept any clear three-move process (first … then … so that …); the last move must be the harm. Part B: managers should recognise employees’ contributions.</w:t>
       </w:r>
     </w:p>
     <w:p>
@@ -2068,7 +2048,7 @@
           <w:p>
             <w:r>
               <w:rPr/>
-              <w:t>For example, some employees find it hard to switch off when they work from home.</w:t>
+              <w:t>For example, employees do their jobs from home on some days, but they cannot switch off.</w:t>
             </w:r>
           </w:p>
         </w:tc>
@@ -2100,7 +2080,7 @@
                 <w:b/>
                 <w:color w:val="C00000"/>
               </w:rPr>
-              <w:t>Imagine a sales executive whose office is now the kitchen table: one email is answered while the kettle boils, another during dinner, and by ten o’clock the laptop is still open in front of the television.</w:t>
+              <w:t>Imagine a sales executive whose office is now the kitchen table: one email is answered while the kettle boils, another during dinner, and by ten o’clock the laptop is still open.</w:t>
             </w:r>
           </w:p>
         </w:tc>
@@ -2121,7 +2101,7 @@
         <w:rPr>
           <w:color w:val="C00000"/>
         </w:rPr>
-        <w:t>Accept any scene with one worker, one place and one object. The final detail must show the harm (the evening has gone), not repeat the topic sentence.</w:t>
+        <w:t>Accept any scene with one worker, one place and one object; the last detail must show the harm. Part B: employees work remotely on a hybrid schedule.</w:t>
       </w:r>
     </w:p>
     <w:p>
@@ -2170,7 +2150,7 @@
           <w:p>
             <w:r>
               <w:rPr/>
-              <w:t>The company should stop sending work messages after office hours.</w:t>
+              <w:t>The company should stop contacting staff outside office hours.</w:t>
             </w:r>
           </w:p>
         </w:tc>
@@ -2231,7 +2211,7 @@
                 <w:b/>
                 <w:color w:val="C00000"/>
               </w:rPr>
-              <w:t>In January 2017, France required companies with fifty or more staff to agree rules on out-of-hours work contact — evidence that even governments now treat constant availability as a problem. A manager who waits until morning sends the same instruction and keeps a colleague, and that habit costs our company nothing.</w:t>
+              <w:t>In January 2017, France required companies with fifty or more staff to agree rules on out-of-hours contact — evidence that even governments treat constant availability as a problem. A manager who waits until morning sends the same instruction and keeps a colleague, and that habit costs the company nothing.</w:t>
             </w:r>
           </w:p>
         </w:tc>
@@ -2301,7 +2281,7 @@
           <w:p>
             <w:r>
               <w:rPr/>
-              <w:t>Unpaid overtime has become normal in many Hong Kong offices.</w:t>
+              <w:t>Companies should not leave overtime unpaid.</w:t>
             </w:r>
           </w:p>
         </w:tc>
@@ -2330,7 +2310,7 @@
           <w:p>
             <w:r>
               <w:rPr/>
-              <w:t>For example, staff work extra hours but get nothing back.</w:t>
+              <w:t>For example, workers do extra work but they do not get any money for it.</w:t>
             </w:r>
           </w:p>
         </w:tc>
@@ -2362,7 +2342,7 @@
                 <w:b/>
                 <w:color w:val="C00000"/>
               </w:rPr>
-              <w:t>Consider what happens when the extra hours are never recorded: the first hour is given “just this once”, the second becomes expected, and by the end of the quarter the team is working a seventh day for the same salary. Overtime that nobody counts is the quietest way a company takes from its staff, and it is the first thing a new colleague notices.</w:t>
+              <w:t>Consider what happens when the extra hours are never recorded: the first hour is given “just this once”, the second becomes expected, and by the end of the year the team is working a seventh day for the same salary. Overtime that nobody counts is the quietest way a company takes from its staff.</w:t>
             </w:r>
           </w:p>
         </w:tc>
@@ -2383,7 +2363,7 @@
         <w:rPr>
           <w:color w:val="C00000"/>
         </w:rPr>
-        <w:t>Accept any three-move process. The round-off must return to the unpaid hours, not to “over-time in general”.</w:t>
+        <w:t>Accept any three-move process. The round-off must return to the unpaid hours, not to “overtime in general”.</w:t>
       </w:r>
     </w:p>
     <w:p>
@@ -2432,7 +2412,7 @@
           <w:p>
             <w:r>
               <w:rPr/>
-              <w:t>Employers should give fresh graduates more training and support.</w:t>
+              <w:t>Employers should provide proper induction and mentoring for new staff.</w:t>
             </w:r>
           </w:p>
         </w:tc>
@@ -2461,7 +2441,7 @@
           <w:p>
             <w:r>
               <w:rPr/>
-              <w:t>For example, new staff are given work they cannot do.</w:t>
+              <w:t>For example, new staff are given work but no training.</w:t>
             </w:r>
           </w:p>
         </w:tc>
@@ -2493,7 +2473,7 @@
                 <w:b/>
                 <w:color w:val="C00000"/>
               </w:rPr>
-              <w:t>Imagine a graduate in her first month who is handed a client’s whole account and a one-line brief: she works until midnight, repeats the same mistakes, and learns only that the office is a lonely place. Patience with a new colleague in the first year is how a company grows its own experts instead of buying them.</w:t>
+              <w:t>Imagine a graduate in her first month who is given a client’s whole account and a one-line brief: she works until midnight, repeats the same mistakes, and learns only that the office is a lonely place. Patience with a new colleague in the first year is how a company grows its own experts instead of buying them.</w:t>
             </w:r>
           </w:p>
         </w:tc>
@@ -2514,7 +2494,7 @@
         <w:rPr>
           <w:color w:val="C00000"/>
         </w:rPr>
-        <w:t>The scene must be about the graduates themselves (not about a manager who trains them), and the round-off must echo the question’s key words.</w:t>
+        <w:t>The scene must be about the graduates themselves, and the round-off must echo the question’s key words. Part B: give new staff induction and mentoring.</w:t>
       </w:r>
     </w:p>
     <w:p>
@@ -2630,7 +2610,7 @@
       </w:pPr>
       <w:r>
         <w:rPr/>
-        <w:t>There is an urgent need for Reboot Online to put an out-of-hours contact policy in writing.</w:t>
+        <w:t>There is an urgent need for Reboot Online to stop contacting staff outside office hours.</w:t>
       </w:r>
       <w:r>
         <w:rPr>
@@ -2640,7 +2620,7 @@
       </w:r>
       <w:r>
         <w:rPr/>
-        <w:t>The problem is not the rare emergency but the drip of ordinary messages: a question about tomorrow’s meeting sent at ten o’clock still costs an employee the evening, because a mind that is half at work never fully rests.</w:t>
+        <w:t>The problem is not a real emergency; it is the ordinary message that arrives at ten o’clock at night. It can wait until morning, yet it keeps the employee half at work — and long hours are what damage health.</w:t>
       </w:r>
       <w:r>
         <w:rPr>
@@ -2650,7 +2630,7 @@
       </w:r>
       <w:r>
         <w:rPr/>
-        <w:t>According to a 2021 joint study by the World Health Organization and the International Labour Organization, staff who work 55 hours or more a week run a 35% higher risk of stroke than those who work 35 to 40 hours.</w:t>
+        <w:t>According to a 2021 WHO and ILO study, working 55 hours or more a week raises the risk of stroke by 35%.</w:t>
       </w:r>
       <w:r>
         <w:rPr>
@@ -2660,7 +2640,7 @@
       </w:r>
       <w:r>
         <w:rPr/>
-        <w:t>Protecting our evenings is therefore the cheapest health insurance this company can buy, and it costs nothing but a rule.</w:t>
+        <w:t>A rule that protects our evenings costs the company nothing, and staff who are not tired are worth far more than a message sent at midnight.</w:t>
       </w:r>
       <w:r>
         <w:rPr>
@@ -2696,7 +2676,7 @@
       </w:r>
       <w:r>
         <w:rPr/>
-        <w:t>Vague goodwill does not survive a busy quarter, whereas a written policy tells each manager when a message really cannot wait until morning and when it must.</w:t>
+        <w:t>A vague promise does not survive a busy month, but a written rule tells every manager when a message cannot wait and when it can.</w:t>
       </w:r>
       <w:r>
         <w:rPr>
@@ -2706,7 +2686,7 @@
       </w:r>
       <w:r>
         <w:rPr/>
-        <w:t>In August 2024, Australia gave employees the legal right to ignore work emails and calls after hours — evidence that even governments now treat constant availability as a problem.</w:t>
+        <w:t>In August 2024, Australia gave workers the right to ignore work messages after hours — evidence that even governments treat constant availability as a problem.</w:t>
       </w:r>
       <w:r>
         <w:rPr>
@@ -2752,7 +2732,7 @@
       </w:r>
       <w:r>
         <w:rPr/>
-        <w:t>Respect is shown in small habits, and a team that knows when it may switch off plans its day better instead of scattering its work across the night.</w:t>
+        <w:t>Respect is shown in small habits: a team that knows when it may switch off plans its day better and stops taking its work home.</w:t>
       </w:r>
       <w:r>
         <w:rPr>
@@ -2762,7 +2742,7 @@
       </w:r>
       <w:r>
         <w:rPr/>
-        <w:t>Imagine a junior clerk at Reboot Online who leaves the office at seven: because his manager keeps until morning everything that can wait, he reaches home in time for dinner and returns the next day with something left to give.</w:t>
+        <w:t>Imagine a clerk at Reboot Online who leaves the office at seven: because his manager keeps everything that can wait until morning, he gets home for dinner and comes back with something left to give.</w:t>
       </w:r>
       <w:r>
         <w:rPr>
@@ -2772,7 +2752,7 @@
       </w:r>
       <w:r>
         <w:rPr/>
-        <w:t>A few quiet hours are a small price for staff who arrive rested, and our company would be foolish to pay more for less.</w:t>
+        <w:t>A few quiet hours cost the company nothing, and staff who arrive rested do better work.</w:t>
       </w:r>
       <w:r>
         <w:rPr>

</xml_diff>